<commit_message>
se agrega un componente que notifica cual archivo se ha cargado y cual no
</commit_message>
<xml_diff>
--- a/plantilla_reporte.docx
+++ b/plantilla_reporte.docx
@@ -518,6 +518,7 @@
                               <w:rPr>
                                 <w:rFonts w:ascii="Arial" w:hAnsi="Arial"/>
                                 <w:b/>
+                                <w:color w:val="215E99"/>
                                 <w:sz w:val="28"/>
                               </w:rPr>
                               <w:t>{{ cover_date }}</w:t>
@@ -660,6 +661,7 @@
                         <w:rPr>
                           <w:rFonts w:ascii="Arial" w:hAnsi="Arial"/>
                           <w:b/>
+                          <w:color w:val="215E99"/>
                           <w:sz w:val="28"/>
                         </w:rPr>
                         <w:t>{{ cover_date }}</w:t>
@@ -1662,7 +1664,23 @@
             <w:vAlign w:val="center"/>
           </w:tcPr>
           <w:p>
+            <w:pPr>
+              <w:jc w:val="center"/>
+              <w:textAlignment w:val="bottom"/>
+              <w:rPr>
+                <w:rFonts w:ascii="Arial" w:hAnsi="Arial" w:cs="Arial"/>
+                <w:b/>
+                <w:bCs/>
+                <w:sz w:val="20"/>
+                <w:szCs w:val="20"/>
+              </w:rPr>
+            </w:pPr>
             <w:r>
+              <w:rPr>
+                <w:rFonts w:ascii="Arial" w:hAnsi="Arial"/>
+                <w:b/>
+                <w:sz w:val="20"/>
+              </w:rPr>
               <w:t>{{ r.site }}</w:t>
             </w:r>
           </w:p>
@@ -1684,7 +1702,23 @@
             </w:tcMar>
           </w:tcPr>
           <w:p>
+            <w:pPr>
+              <w:jc w:val="center"/>
+              <w:textAlignment w:val="bottom"/>
+              <w:rPr>
+                <w:rFonts w:ascii="Arial" w:hAnsi="Arial" w:cs="Arial"/>
+                <w:b/>
+                <w:bCs/>
+                <w:sz w:val="20"/>
+                <w:szCs w:val="20"/>
+              </w:rPr>
+            </w:pPr>
             <w:r>
+              <w:rPr>
+                <w:rFonts w:ascii="Arial" w:hAnsi="Arial"/>
+                <w:b/>
+                <w:sz w:val="20"/>
+              </w:rPr>
               <w:t>{{ r.opening }}</w:t>
             </w:r>
           </w:p>
@@ -1706,7 +1740,23 @@
             </w:tcMar>
           </w:tcPr>
           <w:p>
+            <w:pPr>
+              <w:jc w:val="center"/>
+              <w:textAlignment w:val="bottom"/>
+              <w:rPr>
+                <w:rFonts w:ascii="Arial" w:hAnsi="Arial" w:cs="Arial"/>
+                <w:b/>
+                <w:bCs/>
+                <w:sz w:val="20"/>
+                <w:szCs w:val="20"/>
+              </w:rPr>
+            </w:pPr>
             <w:r>
+              <w:rPr>
+                <w:rFonts w:ascii="Arial" w:hAnsi="Arial"/>
+                <w:b/>
+                <w:sz w:val="20"/>
+              </w:rPr>
               <w:t>{{ r.deliveries }}</w:t>
             </w:r>
           </w:p>
@@ -1728,7 +1778,23 @@
             </w:tcMar>
           </w:tcPr>
           <w:p>
+            <w:pPr>
+              <w:jc w:val="center"/>
+              <w:textAlignment w:val="bottom"/>
+              <w:rPr>
+                <w:rFonts w:ascii="Arial" w:hAnsi="Arial" w:cs="Arial"/>
+                <w:b/>
+                <w:bCs/>
+                <w:sz w:val="20"/>
+                <w:szCs w:val="20"/>
+              </w:rPr>
+            </w:pPr>
             <w:r>
+              <w:rPr>
+                <w:rFonts w:ascii="Arial" w:hAnsi="Arial"/>
+                <w:b/>
+                <w:sz w:val="20"/>
+              </w:rPr>
               <w:t>{{ r.transactions }}</w:t>
             </w:r>
           </w:p>
@@ -1750,7 +1816,23 @@
             </w:tcMar>
           </w:tcPr>
           <w:p>
+            <w:pPr>
+              <w:jc w:val="center"/>
+              <w:textAlignment w:val="bottom"/>
+              <w:rPr>
+                <w:rFonts w:ascii="Arial" w:hAnsi="Arial" w:cs="Arial"/>
+                <w:b/>
+                <w:bCs/>
+                <w:sz w:val="20"/>
+                <w:szCs w:val="20"/>
+              </w:rPr>
+            </w:pPr>
             <w:r>
+              <w:rPr>
+                <w:rFonts w:ascii="Arial" w:hAnsi="Arial"/>
+                <w:b/>
+                <w:sz w:val="20"/>
+              </w:rPr>
               <w:t>{{ r.calc_stock }}</w:t>
             </w:r>
           </w:p>
@@ -1772,7 +1854,23 @@
             </w:tcMar>
           </w:tcPr>
           <w:p>
+            <w:pPr>
+              <w:jc w:val="center"/>
+              <w:textAlignment w:val="bottom"/>
+              <w:rPr>
+                <w:rFonts w:ascii="Arial" w:hAnsi="Arial" w:cs="Arial"/>
+                <w:b/>
+                <w:bCs/>
+                <w:sz w:val="20"/>
+                <w:szCs w:val="20"/>
+              </w:rPr>
+            </w:pPr>
             <w:r>
+              <w:rPr>
+                <w:rFonts w:ascii="Arial" w:hAnsi="Arial"/>
+                <w:b/>
+                <w:sz w:val="20"/>
+              </w:rPr>
               <w:t>{{ r.net_change }}</w:t>
             </w:r>
           </w:p>
@@ -1794,7 +1892,23 @@
             </w:tcMar>
           </w:tcPr>
           <w:p>
+            <w:pPr>
+              <w:jc w:val="center"/>
+              <w:textAlignment w:val="bottom"/>
+              <w:rPr>
+                <w:rFonts w:ascii="Arial" w:hAnsi="Arial" w:cs="Arial"/>
+                <w:b/>
+                <w:bCs/>
+                <w:sz w:val="20"/>
+                <w:szCs w:val="20"/>
+              </w:rPr>
+            </w:pPr>
             <w:r>
+              <w:rPr>
+                <w:rFonts w:ascii="Arial" w:hAnsi="Arial"/>
+                <w:b/>
+                <w:sz w:val="20"/>
+              </w:rPr>
               <w:t>{{ r.closing }}</w:t>
             </w:r>
           </w:p>
@@ -1816,7 +1930,23 @@
             </w:tcMar>
           </w:tcPr>
           <w:p>
+            <w:pPr>
+              <w:jc w:val="center"/>
+              <w:textAlignment w:val="bottom"/>
+              <w:rPr>
+                <w:rFonts w:ascii="Arial" w:hAnsi="Arial" w:cs="Arial"/>
+                <w:b/>
+                <w:bCs/>
+                <w:sz w:val="20"/>
+                <w:szCs w:val="20"/>
+              </w:rPr>
+            </w:pPr>
             <w:r>
+              <w:rPr>
+                <w:rFonts w:ascii="Arial" w:hAnsi="Arial"/>
+                <w:b/>
+                <w:sz w:val="20"/>
+              </w:rPr>
               <w:t>{{ r.variance }}</w:t>
             </w:r>
           </w:p>
@@ -1838,7 +1968,23 @@
             </w:tcMar>
           </w:tcPr>
           <w:p>
+            <w:pPr>
+              <w:jc w:val="center"/>
+              <w:textAlignment w:val="bottom"/>
+              <w:rPr>
+                <w:rFonts w:ascii="Arial" w:hAnsi="Arial" w:cs="Arial"/>
+                <w:b/>
+                <w:bCs/>
+                <w:sz w:val="20"/>
+                <w:szCs w:val="20"/>
+              </w:rPr>
+            </w:pPr>
             <w:r>
+              <w:rPr>
+                <w:rFonts w:ascii="Arial" w:hAnsi="Arial"/>
+                <w:b/>
+                <w:sz w:val="20"/>
+              </w:rPr>
               <w:t>{{ r.pct }}</w:t>
             </w:r>
           </w:p>
@@ -2913,7 +3059,23 @@
             <w:vAlign w:val="center"/>
           </w:tcPr>
           <w:p>
+            <w:pPr>
+              <w:jc w:val="center"/>
+              <w:textAlignment w:val="bottom"/>
+              <w:rPr>
+                <w:rFonts w:ascii="Arial" w:hAnsi="Arial" w:cs="Arial"/>
+                <w:b/>
+                <w:bCs/>
+                <w:sz w:val="20"/>
+                <w:szCs w:val="20"/>
+              </w:rPr>
+            </w:pPr>
             <w:r>
+              <w:rPr>
+                <w:rFonts w:ascii="Arial" w:hAnsi="Arial"/>
+                <w:b/>
+                <w:sz w:val="20"/>
+              </w:rPr>
               <w:t>{{ p1_stock.site }}</w:t>
             </w:r>
           </w:p>
@@ -2935,7 +3097,23 @@
             </w:tcMar>
           </w:tcPr>
           <w:p>
+            <w:pPr>
+              <w:jc w:val="center"/>
+              <w:textAlignment w:val="bottom"/>
+              <w:rPr>
+                <w:rFonts w:ascii="Arial" w:hAnsi="Arial" w:cs="Arial"/>
+                <w:b/>
+                <w:bCs/>
+                <w:sz w:val="20"/>
+                <w:szCs w:val="20"/>
+              </w:rPr>
+            </w:pPr>
             <w:r>
+              <w:rPr>
+                <w:rFonts w:ascii="Arial" w:hAnsi="Arial"/>
+                <w:b/>
+                <w:sz w:val="20"/>
+              </w:rPr>
               <w:t>{{ p1_stock.opening }}</w:t>
             </w:r>
           </w:p>
@@ -2957,7 +3135,23 @@
             </w:tcMar>
           </w:tcPr>
           <w:p>
+            <w:pPr>
+              <w:jc w:val="center"/>
+              <w:textAlignment w:val="bottom"/>
+              <w:rPr>
+                <w:rFonts w:ascii="Arial" w:hAnsi="Arial" w:cs="Arial"/>
+                <w:b/>
+                <w:bCs/>
+                <w:sz w:val="20"/>
+                <w:szCs w:val="20"/>
+              </w:rPr>
+            </w:pPr>
             <w:r>
+              <w:rPr>
+                <w:rFonts w:ascii="Arial" w:hAnsi="Arial"/>
+                <w:b/>
+                <w:sz w:val="20"/>
+              </w:rPr>
               <w:t>{{ p1_stock.deliveries }}</w:t>
             </w:r>
           </w:p>
@@ -2979,7 +3173,23 @@
             </w:tcMar>
           </w:tcPr>
           <w:p>
+            <w:pPr>
+              <w:jc w:val="center"/>
+              <w:textAlignment w:val="bottom"/>
+              <w:rPr>
+                <w:rFonts w:ascii="Arial" w:hAnsi="Arial" w:cs="Arial"/>
+                <w:b/>
+                <w:bCs/>
+                <w:sz w:val="20"/>
+                <w:szCs w:val="20"/>
+              </w:rPr>
+            </w:pPr>
             <w:r>
+              <w:rPr>
+                <w:rFonts w:ascii="Arial" w:hAnsi="Arial"/>
+                <w:b/>
+                <w:sz w:val="20"/>
+              </w:rPr>
               <w:t>{{ p1_stock.transactions }}</w:t>
             </w:r>
           </w:p>
@@ -3001,7 +3211,23 @@
             </w:tcMar>
           </w:tcPr>
           <w:p>
+            <w:pPr>
+              <w:jc w:val="center"/>
+              <w:textAlignment w:val="bottom"/>
+              <w:rPr>
+                <w:rFonts w:ascii="Arial" w:hAnsi="Arial" w:cs="Arial"/>
+                <w:b/>
+                <w:bCs/>
+                <w:sz w:val="20"/>
+                <w:szCs w:val="20"/>
+              </w:rPr>
+            </w:pPr>
             <w:r>
+              <w:rPr>
+                <w:rFonts w:ascii="Arial" w:hAnsi="Arial"/>
+                <w:b/>
+                <w:sz w:val="20"/>
+              </w:rPr>
               <w:t>{{ p1_stock.calc_stock }}</w:t>
             </w:r>
           </w:p>
@@ -3023,7 +3249,23 @@
             </w:tcMar>
           </w:tcPr>
           <w:p>
+            <w:pPr>
+              <w:jc w:val="center"/>
+              <w:textAlignment w:val="bottom"/>
+              <w:rPr>
+                <w:rFonts w:ascii="Arial" w:hAnsi="Arial" w:cs="Arial"/>
+                <w:b/>
+                <w:bCs/>
+                <w:sz w:val="20"/>
+                <w:szCs w:val="20"/>
+              </w:rPr>
+            </w:pPr>
             <w:r>
+              <w:rPr>
+                <w:rFonts w:ascii="Arial" w:hAnsi="Arial"/>
+                <w:b/>
+                <w:sz w:val="20"/>
+              </w:rPr>
               <w:t>{{ p1_stock.net_change }}</w:t>
             </w:r>
           </w:p>
@@ -3045,7 +3287,23 @@
             </w:tcMar>
           </w:tcPr>
           <w:p>
+            <w:pPr>
+              <w:jc w:val="center"/>
+              <w:textAlignment w:val="bottom"/>
+              <w:rPr>
+                <w:rFonts w:ascii="Arial" w:hAnsi="Arial" w:cs="Arial"/>
+                <w:b/>
+                <w:bCs/>
+                <w:sz w:val="20"/>
+                <w:szCs w:val="20"/>
+              </w:rPr>
+            </w:pPr>
             <w:r>
+              <w:rPr>
+                <w:rFonts w:ascii="Arial" w:hAnsi="Arial"/>
+                <w:b/>
+                <w:sz w:val="20"/>
+              </w:rPr>
               <w:t>{{ p1_stock.closing }}</w:t>
             </w:r>
           </w:p>
@@ -3067,7 +3325,23 @@
             </w:tcMar>
           </w:tcPr>
           <w:p>
+            <w:pPr>
+              <w:jc w:val="center"/>
+              <w:textAlignment w:val="bottom"/>
+              <w:rPr>
+                <w:rFonts w:ascii="Arial" w:hAnsi="Arial" w:cs="Arial"/>
+                <w:b/>
+                <w:bCs/>
+                <w:sz w:val="20"/>
+                <w:szCs w:val="20"/>
+              </w:rPr>
+            </w:pPr>
             <w:r>
+              <w:rPr>
+                <w:rFonts w:ascii="Arial" w:hAnsi="Arial"/>
+                <w:b/>
+                <w:sz w:val="20"/>
+              </w:rPr>
               <w:t>{{ p1_stock.variance }}</w:t>
             </w:r>
           </w:p>
@@ -3089,7 +3363,23 @@
             </w:tcMar>
           </w:tcPr>
           <w:p>
+            <w:pPr>
+              <w:jc w:val="center"/>
+              <w:textAlignment w:val="bottom"/>
+              <w:rPr>
+                <w:rFonts w:ascii="Arial" w:hAnsi="Arial" w:cs="Arial"/>
+                <w:b/>
+                <w:bCs/>
+                <w:sz w:val="20"/>
+                <w:szCs w:val="20"/>
+              </w:rPr>
+            </w:pPr>
             <w:r>
+              <w:rPr>
+                <w:rFonts w:ascii="Arial" w:hAnsi="Arial"/>
+                <w:b/>
+                <w:sz w:val="20"/>
+              </w:rPr>
               <w:t>{{ p1_stock.pct }}</w:t>
             </w:r>
           </w:p>
@@ -3185,6 +3475,7 @@
       <w:r>
         <w:rPr>
           <w:rFonts w:ascii="Arial" w:hAnsi="Arial"/>
+          <w:color w:val="000000"/>
         </w:rPr>
         <w:t>{{r p1_delivery_narrative }}</w:t>
       </w:r>
@@ -3647,7 +3938,21 @@
             <w:noWrap/>
           </w:tcPr>
           <w:p>
+            <w:pPr>
+              <w:jc w:val="center"/>
+              <w:rPr>
+                <w:rFonts w:ascii="Arial" w:hAnsi="Arial" w:cs="Arial"/>
+                <w:color w:val="000000"/>
+                <w:sz w:val="21"/>
+                <w:szCs w:val="21"/>
+              </w:rPr>
+            </w:pPr>
             <w:r>
+              <w:rPr>
+                <w:rFonts w:ascii="Arial" w:hAnsi="Arial"/>
+                <w:color w:val="000000"/>
+                <w:sz w:val="21"/>
+              </w:rPr>
               <w:t>{{ d.date }}</w:t>
             </w:r>
           </w:p>
@@ -3664,7 +3969,21 @@
             <w:noWrap/>
           </w:tcPr>
           <w:p>
+            <w:pPr>
+              <w:jc w:val="center"/>
+              <w:rPr>
+                <w:rFonts w:ascii="Arial" w:hAnsi="Arial" w:cs="Arial"/>
+                <w:color w:val="000000"/>
+                <w:sz w:val="21"/>
+                <w:szCs w:val="21"/>
+              </w:rPr>
+            </w:pPr>
             <w:r>
+              <w:rPr>
+                <w:rFonts w:ascii="Arial" w:hAnsi="Arial"/>
+                <w:color w:val="000000"/>
+                <w:sz w:val="21"/>
+              </w:rPr>
               <w:t>{{ d.volume }}</w:t>
             </w:r>
           </w:p>
@@ -3681,7 +4000,21 @@
             <w:noWrap/>
           </w:tcPr>
           <w:p>
+            <w:pPr>
+              <w:jc w:val="center"/>
+              <w:rPr>
+                <w:rFonts w:ascii="Arial" w:hAnsi="Arial" w:cs="Arial"/>
+                <w:color w:val="000000"/>
+                <w:sz w:val="21"/>
+                <w:szCs w:val="21"/>
+              </w:rPr>
+            </w:pPr>
             <w:r>
+              <w:rPr>
+                <w:rFonts w:ascii="Arial" w:hAnsi="Arial"/>
+                <w:color w:val="000000"/>
+                <w:sz w:val="21"/>
+              </w:rPr>
               <w:t>{{ d.docket }}</w:t>
             </w:r>
           </w:p>
@@ -3697,7 +4030,21 @@
             </w:tcBorders>
           </w:tcPr>
           <w:p>
+            <w:pPr>
+              <w:jc w:val="center"/>
+              <w:rPr>
+                <w:rFonts w:ascii="Arial" w:hAnsi="Arial" w:cs="Arial"/>
+                <w:color w:val="000000"/>
+                <w:sz w:val="21"/>
+                <w:szCs w:val="21"/>
+              </w:rPr>
+            </w:pPr>
             <w:r>
+              <w:rPr>
+                <w:rFonts w:ascii="Arial" w:hAnsi="Arial"/>
+                <w:color w:val="000000"/>
+                <w:sz w:val="21"/>
+              </w:rPr>
               <w:t>{{ d.variance }}</w:t>
             </w:r>
           </w:p>
@@ -3714,7 +4061,21 @@
             <w:noWrap/>
           </w:tcPr>
           <w:p>
+            <w:pPr>
+              <w:jc w:val="center"/>
+              <w:rPr>
+                <w:rFonts w:ascii="Arial" w:hAnsi="Arial" w:cs="Arial"/>
+                <w:color w:val="000000"/>
+                <w:sz w:val="21"/>
+                <w:szCs w:val="21"/>
+              </w:rPr>
+            </w:pPr>
             <w:r>
+              <w:rPr>
+                <w:rFonts w:ascii="Arial" w:hAnsi="Arial"/>
+                <w:color w:val="000000"/>
+                <w:sz w:val="21"/>
+              </w:rPr>
               <w:t>{{ d.pct }}</w:t>
             </w:r>
           </w:p>
@@ -3863,7 +4224,24 @@
             <w:hideMark/>
           </w:tcPr>
           <w:p>
+            <w:pPr>
+              <w:jc w:val="center"/>
+              <w:rPr>
+                <w:rFonts w:ascii="Arial" w:hAnsi="Arial" w:cs="Arial"/>
+                <w:b/>
+                <w:bCs/>
+                <w:color w:val="000000"/>
+                <w:sz w:val="21"/>
+                <w:szCs w:val="21"/>
+              </w:rPr>
+            </w:pPr>
             <w:r>
+              <w:rPr>
+                <w:rFonts w:ascii="Arial" w:hAnsi="Arial"/>
+                <w:b/>
+                <w:color w:val="000000"/>
+                <w:sz w:val="21"/>
+              </w:rPr>
               <w:t>Grand Total</w:t>
             </w:r>
           </w:p>
@@ -3882,7 +4260,24 @@
             <w:hideMark/>
           </w:tcPr>
           <w:p>
+            <w:pPr>
+              <w:jc w:val="center"/>
+              <w:rPr>
+                <w:rFonts w:ascii="Arial" w:hAnsi="Arial" w:cs="Arial"/>
+                <w:b/>
+                <w:bCs/>
+                <w:color w:val="000000"/>
+                <w:sz w:val="21"/>
+                <w:szCs w:val="21"/>
+              </w:rPr>
+            </w:pPr>
             <w:r>
+              <w:rPr>
+                <w:rFonts w:ascii="Arial" w:hAnsi="Arial"/>
+                <w:b/>
+                <w:color w:val="000000"/>
+                <w:sz w:val="21"/>
+              </w:rPr>
               <w:t>{{ p1_dtot.volume }}</w:t>
             </w:r>
           </w:p>
@@ -3901,7 +4296,24 @@
             <w:hideMark/>
           </w:tcPr>
           <w:p>
+            <w:pPr>
+              <w:jc w:val="center"/>
+              <w:rPr>
+                <w:rFonts w:ascii="Arial" w:hAnsi="Arial" w:cs="Arial"/>
+                <w:b/>
+                <w:bCs/>
+                <w:color w:val="000000"/>
+                <w:sz w:val="21"/>
+                <w:szCs w:val="21"/>
+              </w:rPr>
+            </w:pPr>
             <w:r>
+              <w:rPr>
+                <w:rFonts w:ascii="Arial" w:hAnsi="Arial"/>
+                <w:b/>
+                <w:color w:val="000000"/>
+                <w:sz w:val="21"/>
+              </w:rPr>
               <w:t>{{ p1_dtot.docket }}</w:t>
             </w:r>
           </w:p>
@@ -3918,7 +4330,24 @@
             <w:shd w:val="clear" w:color="D9E1F2" w:fill="D9E1F2"/>
           </w:tcPr>
           <w:p>
+            <w:pPr>
+              <w:jc w:val="center"/>
+              <w:rPr>
+                <w:rFonts w:ascii="Arial" w:hAnsi="Arial" w:cs="Arial"/>
+                <w:b/>
+                <w:bCs/>
+                <w:color w:val="000000"/>
+                <w:sz w:val="21"/>
+                <w:szCs w:val="21"/>
+              </w:rPr>
+            </w:pPr>
             <w:r>
+              <w:rPr>
+                <w:rFonts w:ascii="Arial" w:hAnsi="Arial"/>
+                <w:b/>
+                <w:color w:val="000000"/>
+                <w:sz w:val="21"/>
+              </w:rPr>
               <w:t>{{ p1_dtot.variance }}</w:t>
             </w:r>
           </w:p>
@@ -3937,7 +4366,24 @@
             <w:hideMark/>
           </w:tcPr>
           <w:p>
+            <w:pPr>
+              <w:jc w:val="center"/>
+              <w:rPr>
+                <w:rFonts w:ascii="Arial" w:hAnsi="Arial" w:cs="Arial"/>
+                <w:b/>
+                <w:bCs/>
+                <w:color w:val="000000"/>
+                <w:sz w:val="21"/>
+                <w:szCs w:val="21"/>
+              </w:rPr>
+            </w:pPr>
             <w:r>
+              <w:rPr>
+                <w:rFonts w:ascii="Arial" w:hAnsi="Arial"/>
+                <w:b/>
+                <w:color w:val="000000"/>
+                <w:sz w:val="21"/>
+              </w:rPr>
               <w:t>{{ p1_dtot.pct }}</w:t>
             </w:r>
           </w:p>
@@ -4539,7 +4985,23 @@
             <w:vAlign w:val="center"/>
           </w:tcPr>
           <w:p>
+            <w:pPr>
+              <w:jc w:val="center"/>
+              <w:textAlignment w:val="bottom"/>
+              <w:rPr>
+                <w:rFonts w:ascii="Arial" w:hAnsi="Arial" w:cs="Arial"/>
+                <w:b/>
+                <w:bCs/>
+                <w:sz w:val="20"/>
+                <w:szCs w:val="20"/>
+              </w:rPr>
+            </w:pPr>
             <w:r>
+              <w:rPr>
+                <w:rFonts w:ascii="Arial" w:hAnsi="Arial"/>
+                <w:b/>
+                <w:sz w:val="20"/>
+              </w:rPr>
               <w:t>{{ p2_stock.site }}</w:t>
             </w:r>
           </w:p>
@@ -4561,7 +5023,23 @@
             </w:tcMar>
           </w:tcPr>
           <w:p>
+            <w:pPr>
+              <w:jc w:val="center"/>
+              <w:textAlignment w:val="bottom"/>
+              <w:rPr>
+                <w:rFonts w:ascii="Arial" w:hAnsi="Arial" w:cs="Arial"/>
+                <w:b/>
+                <w:bCs/>
+                <w:sz w:val="20"/>
+                <w:szCs w:val="20"/>
+              </w:rPr>
+            </w:pPr>
             <w:r>
+              <w:rPr>
+                <w:rFonts w:ascii="Arial" w:hAnsi="Arial"/>
+                <w:b/>
+                <w:sz w:val="20"/>
+              </w:rPr>
               <w:t>{{ p2_stock.opening }}</w:t>
             </w:r>
           </w:p>
@@ -4583,7 +5061,23 @@
             </w:tcMar>
           </w:tcPr>
           <w:p>
+            <w:pPr>
+              <w:jc w:val="center"/>
+              <w:textAlignment w:val="bottom"/>
+              <w:rPr>
+                <w:rFonts w:ascii="Arial" w:hAnsi="Arial" w:cs="Arial"/>
+                <w:b/>
+                <w:bCs/>
+                <w:sz w:val="20"/>
+                <w:szCs w:val="20"/>
+              </w:rPr>
+            </w:pPr>
             <w:r>
+              <w:rPr>
+                <w:rFonts w:ascii="Arial" w:hAnsi="Arial"/>
+                <w:b/>
+                <w:sz w:val="20"/>
+              </w:rPr>
               <w:t>{{ p2_stock.deliveries }}</w:t>
             </w:r>
           </w:p>
@@ -4605,7 +5099,23 @@
             </w:tcMar>
           </w:tcPr>
           <w:p>
+            <w:pPr>
+              <w:jc w:val="center"/>
+              <w:textAlignment w:val="bottom"/>
+              <w:rPr>
+                <w:rFonts w:ascii="Arial" w:hAnsi="Arial" w:cs="Arial"/>
+                <w:b/>
+                <w:bCs/>
+                <w:sz w:val="20"/>
+                <w:szCs w:val="20"/>
+              </w:rPr>
+            </w:pPr>
             <w:r>
+              <w:rPr>
+                <w:rFonts w:ascii="Arial" w:hAnsi="Arial"/>
+                <w:b/>
+                <w:sz w:val="20"/>
+              </w:rPr>
               <w:t>{{ p2_stock.transactions }}</w:t>
             </w:r>
           </w:p>
@@ -4627,7 +5137,23 @@
             </w:tcMar>
           </w:tcPr>
           <w:p>
+            <w:pPr>
+              <w:jc w:val="center"/>
+              <w:textAlignment w:val="bottom"/>
+              <w:rPr>
+                <w:rFonts w:ascii="Arial" w:hAnsi="Arial" w:cs="Arial"/>
+                <w:b/>
+                <w:bCs/>
+                <w:sz w:val="20"/>
+                <w:szCs w:val="20"/>
+              </w:rPr>
+            </w:pPr>
             <w:r>
+              <w:rPr>
+                <w:rFonts w:ascii="Arial" w:hAnsi="Arial"/>
+                <w:b/>
+                <w:sz w:val="20"/>
+              </w:rPr>
               <w:t>{{ p2_stock.calc_stock }}</w:t>
             </w:r>
           </w:p>
@@ -4649,7 +5175,23 @@
             </w:tcMar>
           </w:tcPr>
           <w:p>
+            <w:pPr>
+              <w:jc w:val="center"/>
+              <w:textAlignment w:val="bottom"/>
+              <w:rPr>
+                <w:rFonts w:ascii="Arial" w:hAnsi="Arial" w:cs="Arial"/>
+                <w:b/>
+                <w:bCs/>
+                <w:sz w:val="20"/>
+                <w:szCs w:val="20"/>
+              </w:rPr>
+            </w:pPr>
             <w:r>
+              <w:rPr>
+                <w:rFonts w:ascii="Arial" w:hAnsi="Arial"/>
+                <w:b/>
+                <w:sz w:val="20"/>
+              </w:rPr>
               <w:t>{{ p2_stock.net_change }}</w:t>
             </w:r>
           </w:p>
@@ -4671,7 +5213,23 @@
             </w:tcMar>
           </w:tcPr>
           <w:p>
+            <w:pPr>
+              <w:jc w:val="center"/>
+              <w:textAlignment w:val="bottom"/>
+              <w:rPr>
+                <w:rFonts w:ascii="Arial" w:hAnsi="Arial" w:cs="Arial"/>
+                <w:b/>
+                <w:bCs/>
+                <w:sz w:val="20"/>
+                <w:szCs w:val="20"/>
+              </w:rPr>
+            </w:pPr>
             <w:r>
+              <w:rPr>
+                <w:rFonts w:ascii="Arial" w:hAnsi="Arial"/>
+                <w:b/>
+                <w:sz w:val="20"/>
+              </w:rPr>
               <w:t>{{ p2_stock.closing }}</w:t>
             </w:r>
           </w:p>
@@ -4693,7 +5251,23 @@
             </w:tcMar>
           </w:tcPr>
           <w:p>
+            <w:pPr>
+              <w:jc w:val="center"/>
+              <w:textAlignment w:val="bottom"/>
+              <w:rPr>
+                <w:rFonts w:ascii="Arial" w:hAnsi="Arial" w:cs="Arial"/>
+                <w:b/>
+                <w:bCs/>
+                <w:sz w:val="20"/>
+                <w:szCs w:val="20"/>
+              </w:rPr>
+            </w:pPr>
             <w:r>
+              <w:rPr>
+                <w:rFonts w:ascii="Arial" w:hAnsi="Arial"/>
+                <w:b/>
+                <w:sz w:val="20"/>
+              </w:rPr>
               <w:t>{{ p2_stock.variance }}</w:t>
             </w:r>
           </w:p>
@@ -4715,7 +5289,23 @@
             </w:tcMar>
           </w:tcPr>
           <w:p>
+            <w:pPr>
+              <w:jc w:val="center"/>
+              <w:textAlignment w:val="bottom"/>
+              <w:rPr>
+                <w:rFonts w:ascii="Arial" w:hAnsi="Arial" w:cs="Arial"/>
+                <w:b/>
+                <w:bCs/>
+                <w:sz w:val="20"/>
+                <w:szCs w:val="20"/>
+              </w:rPr>
+            </w:pPr>
             <w:r>
+              <w:rPr>
+                <w:rFonts w:ascii="Arial" w:hAnsi="Arial"/>
+                <w:b/>
+                <w:sz w:val="20"/>
+              </w:rPr>
               <w:t>{{ p2_stock.pct }}</w:t>
             </w:r>
           </w:p>
@@ -4823,6 +5413,7 @@
       <w:r>
         <w:rPr>
           <w:rFonts w:ascii="Arial" w:hAnsi="Arial"/>
+          <w:color w:val="000000"/>
         </w:rPr>
         <w:t>{{r p2_delivery_narrative }}</w:t>
       </w:r>
@@ -5284,7 +5875,21 @@
             <w:hideMark/>
           </w:tcPr>
           <w:p>
+            <w:pPr>
+              <w:jc w:val="center"/>
+              <w:rPr>
+                <w:rFonts w:ascii="Arial" w:hAnsi="Arial" w:cs="Arial"/>
+                <w:color w:val="000000"/>
+                <w:sz w:val="21"/>
+                <w:szCs w:val="21"/>
+              </w:rPr>
+            </w:pPr>
             <w:r>
+              <w:rPr>
+                <w:rFonts w:ascii="Arial" w:hAnsi="Arial"/>
+                <w:color w:val="000000"/>
+                <w:sz w:val="21"/>
+              </w:rPr>
               <w:t>{{ d.date }}</w:t>
             </w:r>
           </w:p>
@@ -5302,7 +5907,21 @@
             <w:hideMark/>
           </w:tcPr>
           <w:p>
+            <w:pPr>
+              <w:jc w:val="center"/>
+              <w:rPr>
+                <w:rFonts w:ascii="Arial" w:hAnsi="Arial" w:cs="Arial"/>
+                <w:color w:val="000000"/>
+                <w:sz w:val="21"/>
+                <w:szCs w:val="21"/>
+              </w:rPr>
+            </w:pPr>
             <w:r>
+              <w:rPr>
+                <w:rFonts w:ascii="Arial" w:hAnsi="Arial"/>
+                <w:color w:val="000000"/>
+                <w:sz w:val="21"/>
+              </w:rPr>
               <w:t>{{ d.volume }}</w:t>
             </w:r>
           </w:p>
@@ -5320,7 +5939,21 @@
             <w:hideMark/>
           </w:tcPr>
           <w:p>
+            <w:pPr>
+              <w:jc w:val="center"/>
+              <w:rPr>
+                <w:rFonts w:ascii="Arial" w:hAnsi="Arial" w:cs="Arial"/>
+                <w:color w:val="000000"/>
+                <w:sz w:val="21"/>
+                <w:szCs w:val="21"/>
+              </w:rPr>
+            </w:pPr>
             <w:r>
+              <w:rPr>
+                <w:rFonts w:ascii="Arial" w:hAnsi="Arial"/>
+                <w:color w:val="000000"/>
+                <w:sz w:val="21"/>
+              </w:rPr>
               <w:t>{{ d.docket }}</w:t>
             </w:r>
           </w:p>
@@ -5336,7 +5969,21 @@
             </w:tcBorders>
           </w:tcPr>
           <w:p>
+            <w:pPr>
+              <w:jc w:val="center"/>
+              <w:rPr>
+                <w:rFonts w:ascii="Arial" w:hAnsi="Arial" w:cs="Arial"/>
+                <w:color w:val="000000"/>
+                <w:sz w:val="21"/>
+                <w:szCs w:val="21"/>
+              </w:rPr>
+            </w:pPr>
             <w:r>
+              <w:rPr>
+                <w:rFonts w:ascii="Arial" w:hAnsi="Arial"/>
+                <w:color w:val="000000"/>
+                <w:sz w:val="21"/>
+              </w:rPr>
               <w:t>{{ d.variance }}</w:t>
             </w:r>
           </w:p>
@@ -5354,7 +6001,21 @@
             <w:hideMark/>
           </w:tcPr>
           <w:p>
+            <w:pPr>
+              <w:jc w:val="center"/>
+              <w:rPr>
+                <w:rFonts w:ascii="Arial" w:hAnsi="Arial" w:cs="Arial"/>
+                <w:color w:val="000000"/>
+                <w:sz w:val="21"/>
+                <w:szCs w:val="21"/>
+              </w:rPr>
+            </w:pPr>
             <w:r>
+              <w:rPr>
+                <w:rFonts w:ascii="Arial" w:hAnsi="Arial"/>
+                <w:color w:val="000000"/>
+                <w:sz w:val="21"/>
+              </w:rPr>
               <w:t>{{ d.pct }}</w:t>
             </w:r>
           </w:p>
@@ -5507,7 +6168,24 @@
             <w:hideMark/>
           </w:tcPr>
           <w:p>
+            <w:pPr>
+              <w:jc w:val="center"/>
+              <w:rPr>
+                <w:rFonts w:ascii="Arial" w:hAnsi="Arial" w:cs="Arial"/>
+                <w:b/>
+                <w:bCs/>
+                <w:color w:val="000000"/>
+                <w:sz w:val="21"/>
+                <w:szCs w:val="21"/>
+              </w:rPr>
+            </w:pPr>
             <w:r>
+              <w:rPr>
+                <w:rFonts w:ascii="Arial" w:hAnsi="Arial"/>
+                <w:b/>
+                <w:color w:val="000000"/>
+                <w:sz w:val="21"/>
+              </w:rPr>
               <w:t>Grand Total</w:t>
             </w:r>
           </w:p>
@@ -5526,7 +6204,24 @@
             <w:hideMark/>
           </w:tcPr>
           <w:p>
+            <w:pPr>
+              <w:jc w:val="center"/>
+              <w:rPr>
+                <w:rFonts w:ascii="Arial" w:hAnsi="Arial" w:cs="Arial"/>
+                <w:b/>
+                <w:bCs/>
+                <w:color w:val="000000"/>
+                <w:sz w:val="21"/>
+                <w:szCs w:val="21"/>
+              </w:rPr>
+            </w:pPr>
             <w:r>
+              <w:rPr>
+                <w:rFonts w:ascii="Arial" w:hAnsi="Arial"/>
+                <w:b/>
+                <w:color w:val="000000"/>
+                <w:sz w:val="21"/>
+              </w:rPr>
               <w:t>{{ p2_dtot.volume }}</w:t>
             </w:r>
           </w:p>
@@ -5545,7 +6240,24 @@
             <w:hideMark/>
           </w:tcPr>
           <w:p>
+            <w:pPr>
+              <w:jc w:val="center"/>
+              <w:rPr>
+                <w:rFonts w:ascii="Arial" w:hAnsi="Arial" w:cs="Arial"/>
+                <w:b/>
+                <w:bCs/>
+                <w:color w:val="000000"/>
+                <w:sz w:val="21"/>
+                <w:szCs w:val="21"/>
+              </w:rPr>
+            </w:pPr>
             <w:r>
+              <w:rPr>
+                <w:rFonts w:ascii="Arial" w:hAnsi="Arial"/>
+                <w:b/>
+                <w:color w:val="000000"/>
+                <w:sz w:val="21"/>
+              </w:rPr>
               <w:t>{{ p2_dtot.docket }}</w:t>
             </w:r>
           </w:p>
@@ -5562,7 +6274,24 @@
             <w:shd w:val="clear" w:color="D9E1F2" w:fill="D9E1F2"/>
           </w:tcPr>
           <w:p>
+            <w:pPr>
+              <w:jc w:val="center"/>
+              <w:rPr>
+                <w:rFonts w:ascii="Arial" w:hAnsi="Arial" w:cs="Arial"/>
+                <w:b/>
+                <w:bCs/>
+                <w:color w:val="000000"/>
+                <w:sz w:val="21"/>
+                <w:szCs w:val="21"/>
+              </w:rPr>
+            </w:pPr>
             <w:r>
+              <w:rPr>
+                <w:rFonts w:ascii="Arial" w:hAnsi="Arial"/>
+                <w:b/>
+                <w:color w:val="000000"/>
+                <w:sz w:val="21"/>
+              </w:rPr>
               <w:t>{{ p2_dtot.variance }}</w:t>
             </w:r>
           </w:p>
@@ -5581,7 +6310,24 @@
             <w:hideMark/>
           </w:tcPr>
           <w:p>
+            <w:pPr>
+              <w:jc w:val="center"/>
+              <w:rPr>
+                <w:rFonts w:ascii="Arial" w:hAnsi="Arial" w:cs="Arial"/>
+                <w:b/>
+                <w:bCs/>
+                <w:color w:val="000000"/>
+                <w:sz w:val="21"/>
+                <w:szCs w:val="21"/>
+              </w:rPr>
+            </w:pPr>
             <w:r>
+              <w:rPr>
+                <w:rFonts w:ascii="Arial" w:hAnsi="Arial"/>
+                <w:b/>
+                <w:color w:val="000000"/>
+                <w:sz w:val="21"/>
+              </w:rPr>
               <w:t>{{ p2_dtot.pct }}</w:t>
             </w:r>
           </w:p>
@@ -6223,7 +6969,23 @@
             <w:vAlign w:val="center"/>
           </w:tcPr>
           <w:p>
+            <w:pPr>
+              <w:jc w:val="center"/>
+              <w:textAlignment w:val="bottom"/>
+              <w:rPr>
+                <w:rFonts w:ascii="Arial" w:hAnsi="Arial" w:cs="Arial"/>
+                <w:b/>
+                <w:bCs/>
+                <w:sz w:val="20"/>
+                <w:szCs w:val="20"/>
+              </w:rPr>
+            </w:pPr>
             <w:r>
+              <w:rPr>
+                <w:rFonts w:ascii="Arial" w:hAnsi="Arial"/>
+                <w:b/>
+                <w:sz w:val="20"/>
+              </w:rPr>
               <w:t>{{ p3_stock.site }}</w:t>
             </w:r>
           </w:p>
@@ -6245,7 +7007,23 @@
             </w:tcMar>
           </w:tcPr>
           <w:p>
+            <w:pPr>
+              <w:jc w:val="center"/>
+              <w:textAlignment w:val="bottom"/>
+              <w:rPr>
+                <w:rFonts w:ascii="Arial" w:hAnsi="Arial" w:cs="Arial"/>
+                <w:b/>
+                <w:bCs/>
+                <w:sz w:val="20"/>
+                <w:szCs w:val="20"/>
+              </w:rPr>
+            </w:pPr>
             <w:r>
+              <w:rPr>
+                <w:rFonts w:ascii="Arial" w:hAnsi="Arial"/>
+                <w:b/>
+                <w:sz w:val="20"/>
+              </w:rPr>
               <w:t>{{ p3_stock.opening }}</w:t>
             </w:r>
           </w:p>
@@ -6267,7 +7045,23 @@
             </w:tcMar>
           </w:tcPr>
           <w:p>
+            <w:pPr>
+              <w:jc w:val="center"/>
+              <w:textAlignment w:val="bottom"/>
+              <w:rPr>
+                <w:rFonts w:ascii="Arial" w:hAnsi="Arial" w:cs="Arial"/>
+                <w:b/>
+                <w:bCs/>
+                <w:sz w:val="20"/>
+                <w:szCs w:val="20"/>
+              </w:rPr>
+            </w:pPr>
             <w:r>
+              <w:rPr>
+                <w:rFonts w:ascii="Arial" w:hAnsi="Arial"/>
+                <w:b/>
+                <w:sz w:val="20"/>
+              </w:rPr>
               <w:t>{{ p3_stock.deliveries }}</w:t>
             </w:r>
           </w:p>
@@ -6289,7 +7083,23 @@
             </w:tcMar>
           </w:tcPr>
           <w:p>
+            <w:pPr>
+              <w:jc w:val="center"/>
+              <w:textAlignment w:val="bottom"/>
+              <w:rPr>
+                <w:rFonts w:ascii="Arial" w:hAnsi="Arial" w:cs="Arial"/>
+                <w:b/>
+                <w:bCs/>
+                <w:sz w:val="20"/>
+                <w:szCs w:val="20"/>
+              </w:rPr>
+            </w:pPr>
             <w:r>
+              <w:rPr>
+                <w:rFonts w:ascii="Arial" w:hAnsi="Arial"/>
+                <w:b/>
+                <w:sz w:val="20"/>
+              </w:rPr>
               <w:t>{{ p3_stock.transactions }}</w:t>
             </w:r>
           </w:p>
@@ -6311,7 +7121,23 @@
             </w:tcMar>
           </w:tcPr>
           <w:p>
+            <w:pPr>
+              <w:jc w:val="center"/>
+              <w:textAlignment w:val="bottom"/>
+              <w:rPr>
+                <w:rFonts w:ascii="Arial" w:hAnsi="Arial" w:cs="Arial"/>
+                <w:b/>
+                <w:bCs/>
+                <w:sz w:val="20"/>
+                <w:szCs w:val="20"/>
+              </w:rPr>
+            </w:pPr>
             <w:r>
+              <w:rPr>
+                <w:rFonts w:ascii="Arial" w:hAnsi="Arial"/>
+                <w:b/>
+                <w:sz w:val="20"/>
+              </w:rPr>
               <w:t>{{ p3_stock.calc_stock }}</w:t>
             </w:r>
           </w:p>
@@ -6333,7 +7159,23 @@
             </w:tcMar>
           </w:tcPr>
           <w:p>
+            <w:pPr>
+              <w:jc w:val="center"/>
+              <w:textAlignment w:val="bottom"/>
+              <w:rPr>
+                <w:rFonts w:ascii="Arial" w:hAnsi="Arial" w:cs="Arial"/>
+                <w:b/>
+                <w:bCs/>
+                <w:sz w:val="20"/>
+                <w:szCs w:val="20"/>
+              </w:rPr>
+            </w:pPr>
             <w:r>
+              <w:rPr>
+                <w:rFonts w:ascii="Arial" w:hAnsi="Arial"/>
+                <w:b/>
+                <w:sz w:val="20"/>
+              </w:rPr>
               <w:t>{{ p3_stock.net_change }}</w:t>
             </w:r>
           </w:p>
@@ -6355,7 +7197,23 @@
             </w:tcMar>
           </w:tcPr>
           <w:p>
+            <w:pPr>
+              <w:jc w:val="center"/>
+              <w:textAlignment w:val="bottom"/>
+              <w:rPr>
+                <w:rFonts w:ascii="Arial" w:hAnsi="Arial" w:cs="Arial"/>
+                <w:b/>
+                <w:bCs/>
+                <w:sz w:val="20"/>
+                <w:szCs w:val="20"/>
+              </w:rPr>
+            </w:pPr>
             <w:r>
+              <w:rPr>
+                <w:rFonts w:ascii="Arial" w:hAnsi="Arial"/>
+                <w:b/>
+                <w:sz w:val="20"/>
+              </w:rPr>
               <w:t>{{ p3_stock.closing }}</w:t>
             </w:r>
           </w:p>
@@ -6377,7 +7235,23 @@
             </w:tcMar>
           </w:tcPr>
           <w:p>
+            <w:pPr>
+              <w:jc w:val="center"/>
+              <w:textAlignment w:val="bottom"/>
+              <w:rPr>
+                <w:rFonts w:ascii="Arial" w:hAnsi="Arial" w:cs="Arial"/>
+                <w:b/>
+                <w:bCs/>
+                <w:sz w:val="20"/>
+                <w:szCs w:val="20"/>
+              </w:rPr>
+            </w:pPr>
             <w:r>
+              <w:rPr>
+                <w:rFonts w:ascii="Arial" w:hAnsi="Arial"/>
+                <w:b/>
+                <w:sz w:val="20"/>
+              </w:rPr>
               <w:t>{{ p3_stock.variance }}</w:t>
             </w:r>
           </w:p>
@@ -6399,7 +7273,23 @@
             </w:tcMar>
           </w:tcPr>
           <w:p>
+            <w:pPr>
+              <w:jc w:val="center"/>
+              <w:textAlignment w:val="bottom"/>
+              <w:rPr>
+                <w:rFonts w:ascii="Arial" w:hAnsi="Arial" w:cs="Arial"/>
+                <w:b/>
+                <w:bCs/>
+                <w:sz w:val="20"/>
+                <w:szCs w:val="20"/>
+              </w:rPr>
+            </w:pPr>
             <w:r>
+              <w:rPr>
+                <w:rFonts w:ascii="Arial" w:hAnsi="Arial"/>
+                <w:b/>
+                <w:sz w:val="20"/>
+              </w:rPr>
               <w:t>{{ p3_stock.pct }}</w:t>
             </w:r>
           </w:p>
@@ -6507,6 +7397,7 @@
       <w:r>
         <w:rPr>
           <w:rFonts w:ascii="Arial" w:hAnsi="Arial"/>
+          <w:color w:val="000000"/>
         </w:rPr>
         <w:t>{{r p3_delivery_narrative }}</w:t>
       </w:r>
@@ -6968,7 +7859,21 @@
             <w:hideMark/>
           </w:tcPr>
           <w:p>
+            <w:pPr>
+              <w:jc w:val="center"/>
+              <w:rPr>
+                <w:rFonts w:ascii="Arial" w:hAnsi="Arial" w:cs="Arial"/>
+                <w:color w:val="000000"/>
+                <w:sz w:val="21"/>
+                <w:szCs w:val="21"/>
+              </w:rPr>
+            </w:pPr>
             <w:r>
+              <w:rPr>
+                <w:rFonts w:ascii="Arial" w:hAnsi="Arial"/>
+                <w:color w:val="000000"/>
+                <w:sz w:val="21"/>
+              </w:rPr>
               <w:t>{{ d.date }}</w:t>
             </w:r>
           </w:p>
@@ -6986,7 +7891,21 @@
             <w:hideMark/>
           </w:tcPr>
           <w:p>
+            <w:pPr>
+              <w:jc w:val="center"/>
+              <w:rPr>
+                <w:rFonts w:ascii="Arial" w:hAnsi="Arial" w:cs="Arial"/>
+                <w:color w:val="000000"/>
+                <w:sz w:val="21"/>
+                <w:szCs w:val="21"/>
+              </w:rPr>
+            </w:pPr>
             <w:r>
+              <w:rPr>
+                <w:rFonts w:ascii="Arial" w:hAnsi="Arial"/>
+                <w:color w:val="000000"/>
+                <w:sz w:val="21"/>
+              </w:rPr>
               <w:t>{{ d.volume }}</w:t>
             </w:r>
           </w:p>
@@ -7004,7 +7923,21 @@
             <w:hideMark/>
           </w:tcPr>
           <w:p>
+            <w:pPr>
+              <w:jc w:val="center"/>
+              <w:rPr>
+                <w:rFonts w:ascii="Arial" w:hAnsi="Arial" w:cs="Arial"/>
+                <w:color w:val="000000"/>
+                <w:sz w:val="21"/>
+                <w:szCs w:val="21"/>
+              </w:rPr>
+            </w:pPr>
             <w:r>
+              <w:rPr>
+                <w:rFonts w:ascii="Arial" w:hAnsi="Arial"/>
+                <w:color w:val="000000"/>
+                <w:sz w:val="21"/>
+              </w:rPr>
               <w:t>{{ d.docket }}</w:t>
             </w:r>
           </w:p>
@@ -7020,7 +7953,21 @@
             </w:tcBorders>
           </w:tcPr>
           <w:p>
+            <w:pPr>
+              <w:jc w:val="center"/>
+              <w:rPr>
+                <w:rFonts w:ascii="Arial" w:hAnsi="Arial" w:cs="Arial"/>
+                <w:color w:val="000000"/>
+                <w:sz w:val="21"/>
+                <w:szCs w:val="21"/>
+              </w:rPr>
+            </w:pPr>
             <w:r>
+              <w:rPr>
+                <w:rFonts w:ascii="Arial" w:hAnsi="Arial"/>
+                <w:color w:val="000000"/>
+                <w:sz w:val="21"/>
+              </w:rPr>
               <w:t>{{ d.variance }}</w:t>
             </w:r>
           </w:p>
@@ -7038,7 +7985,21 @@
             <w:hideMark/>
           </w:tcPr>
           <w:p>
+            <w:pPr>
+              <w:jc w:val="center"/>
+              <w:rPr>
+                <w:rFonts w:ascii="Arial" w:hAnsi="Arial" w:cs="Arial"/>
+                <w:color w:val="000000"/>
+                <w:sz w:val="21"/>
+                <w:szCs w:val="21"/>
+              </w:rPr>
+            </w:pPr>
             <w:r>
+              <w:rPr>
+                <w:rFonts w:ascii="Arial" w:hAnsi="Arial"/>
+                <w:color w:val="000000"/>
+                <w:sz w:val="21"/>
+              </w:rPr>
               <w:t>{{ d.pct }}</w:t>
             </w:r>
           </w:p>
@@ -7191,7 +8152,24 @@
             <w:hideMark/>
           </w:tcPr>
           <w:p>
+            <w:pPr>
+              <w:jc w:val="center"/>
+              <w:rPr>
+                <w:rFonts w:ascii="Arial" w:hAnsi="Arial" w:cs="Arial"/>
+                <w:b/>
+                <w:bCs/>
+                <w:color w:val="000000"/>
+                <w:sz w:val="21"/>
+                <w:szCs w:val="21"/>
+              </w:rPr>
+            </w:pPr>
             <w:r>
+              <w:rPr>
+                <w:rFonts w:ascii="Arial" w:hAnsi="Arial"/>
+                <w:b/>
+                <w:color w:val="000000"/>
+                <w:sz w:val="21"/>
+              </w:rPr>
               <w:t>Grand Total</w:t>
             </w:r>
           </w:p>
@@ -7210,7 +8188,24 @@
             <w:hideMark/>
           </w:tcPr>
           <w:p>
+            <w:pPr>
+              <w:jc w:val="center"/>
+              <w:rPr>
+                <w:rFonts w:ascii="Arial" w:hAnsi="Arial" w:cs="Arial"/>
+                <w:b/>
+                <w:bCs/>
+                <w:color w:val="000000"/>
+                <w:sz w:val="21"/>
+                <w:szCs w:val="21"/>
+              </w:rPr>
+            </w:pPr>
             <w:r>
+              <w:rPr>
+                <w:rFonts w:ascii="Arial" w:hAnsi="Arial"/>
+                <w:b/>
+                <w:color w:val="000000"/>
+                <w:sz w:val="21"/>
+              </w:rPr>
               <w:t>{{ p3_dtot.volume }}</w:t>
             </w:r>
           </w:p>
@@ -7229,7 +8224,24 @@
             <w:hideMark/>
           </w:tcPr>
           <w:p>
+            <w:pPr>
+              <w:jc w:val="center"/>
+              <w:rPr>
+                <w:rFonts w:ascii="Arial" w:hAnsi="Arial" w:cs="Arial"/>
+                <w:b/>
+                <w:bCs/>
+                <w:color w:val="000000"/>
+                <w:sz w:val="21"/>
+                <w:szCs w:val="21"/>
+              </w:rPr>
+            </w:pPr>
             <w:r>
+              <w:rPr>
+                <w:rFonts w:ascii="Arial" w:hAnsi="Arial"/>
+                <w:b/>
+                <w:color w:val="000000"/>
+                <w:sz w:val="21"/>
+              </w:rPr>
               <w:t>{{ p3_dtot.docket }}</w:t>
             </w:r>
           </w:p>
@@ -7246,7 +8258,24 @@
             <w:shd w:val="clear" w:color="D9E1F2" w:fill="D9E1F2"/>
           </w:tcPr>
           <w:p>
+            <w:pPr>
+              <w:jc w:val="center"/>
+              <w:rPr>
+                <w:rFonts w:ascii="Arial" w:hAnsi="Arial" w:cs="Arial"/>
+                <w:b/>
+                <w:bCs/>
+                <w:color w:val="000000"/>
+                <w:sz w:val="21"/>
+                <w:szCs w:val="21"/>
+              </w:rPr>
+            </w:pPr>
             <w:r>
+              <w:rPr>
+                <w:rFonts w:ascii="Arial" w:hAnsi="Arial"/>
+                <w:b/>
+                <w:color w:val="000000"/>
+                <w:sz w:val="21"/>
+              </w:rPr>
               <w:t>{{ p3_dtot.variance }}</w:t>
             </w:r>
           </w:p>
@@ -7265,7 +8294,24 @@
             <w:hideMark/>
           </w:tcPr>
           <w:p>
+            <w:pPr>
+              <w:jc w:val="center"/>
+              <w:rPr>
+                <w:rFonts w:ascii="Arial" w:hAnsi="Arial" w:cs="Arial"/>
+                <w:b/>
+                <w:bCs/>
+                <w:color w:val="000000"/>
+                <w:sz w:val="21"/>
+                <w:szCs w:val="21"/>
+              </w:rPr>
+            </w:pPr>
             <w:r>
+              <w:rPr>
+                <w:rFonts w:ascii="Arial" w:hAnsi="Arial"/>
+                <w:b/>
+                <w:color w:val="000000"/>
+                <w:sz w:val="21"/>
+              </w:rPr>
               <w:t>{{ p3_dtot.pct }}</w:t>
             </w:r>
           </w:p>
@@ -7895,7 +8941,23 @@
             <w:vAlign w:val="center"/>
           </w:tcPr>
           <w:p>
+            <w:pPr>
+              <w:jc w:val="center"/>
+              <w:textAlignment w:val="bottom"/>
+              <w:rPr>
+                <w:rFonts w:ascii="Arial" w:hAnsi="Arial" w:cs="Arial"/>
+                <w:b/>
+                <w:bCs/>
+                <w:sz w:val="20"/>
+                <w:szCs w:val="20"/>
+              </w:rPr>
+            </w:pPr>
             <w:r>
+              <w:rPr>
+                <w:rFonts w:ascii="Arial" w:hAnsi="Arial"/>
+                <w:b/>
+                <w:sz w:val="20"/>
+              </w:rPr>
               <w:t>{{ p4_stock.site }}</w:t>
             </w:r>
           </w:p>
@@ -7917,7 +8979,23 @@
             </w:tcMar>
           </w:tcPr>
           <w:p>
+            <w:pPr>
+              <w:jc w:val="center"/>
+              <w:textAlignment w:val="bottom"/>
+              <w:rPr>
+                <w:rFonts w:ascii="Arial" w:hAnsi="Arial" w:cs="Arial"/>
+                <w:b/>
+                <w:bCs/>
+                <w:sz w:val="20"/>
+                <w:szCs w:val="20"/>
+              </w:rPr>
+            </w:pPr>
             <w:r>
+              <w:rPr>
+                <w:rFonts w:ascii="Arial" w:hAnsi="Arial"/>
+                <w:b/>
+                <w:sz w:val="20"/>
+              </w:rPr>
               <w:t>{{ p4_stock.opening }}</w:t>
             </w:r>
           </w:p>
@@ -7939,7 +9017,23 @@
             </w:tcMar>
           </w:tcPr>
           <w:p>
+            <w:pPr>
+              <w:jc w:val="center"/>
+              <w:textAlignment w:val="bottom"/>
+              <w:rPr>
+                <w:rFonts w:ascii="Arial" w:hAnsi="Arial" w:cs="Arial"/>
+                <w:b/>
+                <w:bCs/>
+                <w:sz w:val="20"/>
+                <w:szCs w:val="20"/>
+              </w:rPr>
+            </w:pPr>
             <w:r>
+              <w:rPr>
+                <w:rFonts w:ascii="Arial" w:hAnsi="Arial"/>
+                <w:b/>
+                <w:sz w:val="20"/>
+              </w:rPr>
               <w:t>{{ p4_stock.deliveries }}</w:t>
             </w:r>
           </w:p>
@@ -7961,7 +9055,23 @@
             </w:tcMar>
           </w:tcPr>
           <w:p>
+            <w:pPr>
+              <w:jc w:val="center"/>
+              <w:textAlignment w:val="bottom"/>
+              <w:rPr>
+                <w:rFonts w:ascii="Arial" w:hAnsi="Arial" w:cs="Arial"/>
+                <w:b/>
+                <w:bCs/>
+                <w:sz w:val="20"/>
+                <w:szCs w:val="20"/>
+              </w:rPr>
+            </w:pPr>
             <w:r>
+              <w:rPr>
+                <w:rFonts w:ascii="Arial" w:hAnsi="Arial"/>
+                <w:b/>
+                <w:sz w:val="20"/>
+              </w:rPr>
               <w:t>{{ p4_stock.transactions }}</w:t>
             </w:r>
           </w:p>
@@ -7983,7 +9093,23 @@
             </w:tcMar>
           </w:tcPr>
           <w:p>
+            <w:pPr>
+              <w:jc w:val="center"/>
+              <w:textAlignment w:val="bottom"/>
+              <w:rPr>
+                <w:rFonts w:ascii="Arial" w:hAnsi="Arial" w:cs="Arial"/>
+                <w:b/>
+                <w:bCs/>
+                <w:sz w:val="20"/>
+                <w:szCs w:val="20"/>
+              </w:rPr>
+            </w:pPr>
             <w:r>
+              <w:rPr>
+                <w:rFonts w:ascii="Arial" w:hAnsi="Arial"/>
+                <w:b/>
+                <w:sz w:val="20"/>
+              </w:rPr>
               <w:t>{{ p4_stock.calc_stock }}</w:t>
             </w:r>
           </w:p>
@@ -8005,7 +9131,23 @@
             </w:tcMar>
           </w:tcPr>
           <w:p>
+            <w:pPr>
+              <w:jc w:val="center"/>
+              <w:textAlignment w:val="bottom"/>
+              <w:rPr>
+                <w:rFonts w:ascii="Arial" w:hAnsi="Arial" w:cs="Arial"/>
+                <w:b/>
+                <w:bCs/>
+                <w:sz w:val="20"/>
+                <w:szCs w:val="20"/>
+              </w:rPr>
+            </w:pPr>
             <w:r>
+              <w:rPr>
+                <w:rFonts w:ascii="Arial" w:hAnsi="Arial"/>
+                <w:b/>
+                <w:sz w:val="20"/>
+              </w:rPr>
               <w:t>{{ p4_stock.net_change }}</w:t>
             </w:r>
           </w:p>
@@ -8027,7 +9169,23 @@
             </w:tcMar>
           </w:tcPr>
           <w:p>
+            <w:pPr>
+              <w:jc w:val="center"/>
+              <w:textAlignment w:val="bottom"/>
+              <w:rPr>
+                <w:rFonts w:ascii="Arial" w:hAnsi="Arial" w:cs="Arial"/>
+                <w:b/>
+                <w:bCs/>
+                <w:sz w:val="20"/>
+                <w:szCs w:val="20"/>
+              </w:rPr>
+            </w:pPr>
             <w:r>
+              <w:rPr>
+                <w:rFonts w:ascii="Arial" w:hAnsi="Arial"/>
+                <w:b/>
+                <w:sz w:val="20"/>
+              </w:rPr>
               <w:t>{{ p4_stock.closing }}</w:t>
             </w:r>
           </w:p>
@@ -8049,7 +9207,23 @@
             </w:tcMar>
           </w:tcPr>
           <w:p>
+            <w:pPr>
+              <w:jc w:val="center"/>
+              <w:textAlignment w:val="bottom"/>
+              <w:rPr>
+                <w:rFonts w:ascii="Arial" w:hAnsi="Arial" w:cs="Arial"/>
+                <w:b/>
+                <w:bCs/>
+                <w:sz w:val="20"/>
+                <w:szCs w:val="20"/>
+              </w:rPr>
+            </w:pPr>
             <w:r>
+              <w:rPr>
+                <w:rFonts w:ascii="Arial" w:hAnsi="Arial"/>
+                <w:b/>
+                <w:sz w:val="20"/>
+              </w:rPr>
               <w:t>{{ p4_stock.variance }}</w:t>
             </w:r>
           </w:p>
@@ -8071,7 +9245,23 @@
             </w:tcMar>
           </w:tcPr>
           <w:p>
+            <w:pPr>
+              <w:jc w:val="center"/>
+              <w:textAlignment w:val="bottom"/>
+              <w:rPr>
+                <w:rFonts w:ascii="Arial" w:hAnsi="Arial" w:cs="Arial"/>
+                <w:b/>
+                <w:bCs/>
+                <w:sz w:val="20"/>
+                <w:szCs w:val="20"/>
+              </w:rPr>
+            </w:pPr>
             <w:r>
+              <w:rPr>
+                <w:rFonts w:ascii="Arial" w:hAnsi="Arial"/>
+                <w:b/>
+                <w:sz w:val="20"/>
+              </w:rPr>
               <w:t>{{ p4_stock.pct }}</w:t>
             </w:r>
           </w:p>
@@ -8177,6 +9367,7 @@
       <w:r>
         <w:rPr>
           <w:rFonts w:ascii="Arial" w:hAnsi="Arial"/>
+          <w:color w:val="000000"/>
         </w:rPr>
         <w:t>{{r p4_delivery_narrative }}</w:t>
       </w:r>
@@ -8638,7 +9829,21 @@
             <w:hideMark/>
           </w:tcPr>
           <w:p>
+            <w:pPr>
+              <w:jc w:val="center"/>
+              <w:rPr>
+                <w:rFonts w:ascii="Arial" w:hAnsi="Arial" w:cs="Arial"/>
+                <w:color w:val="000000"/>
+                <w:sz w:val="21"/>
+                <w:szCs w:val="21"/>
+              </w:rPr>
+            </w:pPr>
             <w:r>
+              <w:rPr>
+                <w:rFonts w:ascii="Arial" w:hAnsi="Arial"/>
+                <w:color w:val="000000"/>
+                <w:sz w:val="21"/>
+              </w:rPr>
               <w:t>{{ d.date }}</w:t>
             </w:r>
           </w:p>
@@ -8656,7 +9861,21 @@
             <w:hideMark/>
           </w:tcPr>
           <w:p>
+            <w:pPr>
+              <w:jc w:val="center"/>
+              <w:rPr>
+                <w:rFonts w:ascii="Arial" w:hAnsi="Arial" w:cs="Arial"/>
+                <w:color w:val="000000"/>
+                <w:sz w:val="21"/>
+                <w:szCs w:val="21"/>
+              </w:rPr>
+            </w:pPr>
             <w:r>
+              <w:rPr>
+                <w:rFonts w:ascii="Arial" w:hAnsi="Arial"/>
+                <w:color w:val="000000"/>
+                <w:sz w:val="21"/>
+              </w:rPr>
               <w:t>{{ d.volume }}</w:t>
             </w:r>
           </w:p>
@@ -8674,7 +9893,21 @@
             <w:hideMark/>
           </w:tcPr>
           <w:p>
+            <w:pPr>
+              <w:jc w:val="center"/>
+              <w:rPr>
+                <w:rFonts w:ascii="Arial" w:hAnsi="Arial" w:cs="Arial"/>
+                <w:color w:val="000000"/>
+                <w:sz w:val="21"/>
+                <w:szCs w:val="21"/>
+              </w:rPr>
+            </w:pPr>
             <w:r>
+              <w:rPr>
+                <w:rFonts w:ascii="Arial" w:hAnsi="Arial"/>
+                <w:color w:val="000000"/>
+                <w:sz w:val="21"/>
+              </w:rPr>
               <w:t>{{ d.docket }}</w:t>
             </w:r>
           </w:p>
@@ -8690,7 +9923,21 @@
             </w:tcBorders>
           </w:tcPr>
           <w:p>
+            <w:pPr>
+              <w:jc w:val="center"/>
+              <w:rPr>
+                <w:rFonts w:ascii="Arial" w:hAnsi="Arial" w:cs="Arial"/>
+                <w:color w:val="000000"/>
+                <w:sz w:val="21"/>
+                <w:szCs w:val="21"/>
+              </w:rPr>
+            </w:pPr>
             <w:r>
+              <w:rPr>
+                <w:rFonts w:ascii="Arial" w:hAnsi="Arial"/>
+                <w:color w:val="000000"/>
+                <w:sz w:val="21"/>
+              </w:rPr>
               <w:t>{{ d.variance }}</w:t>
             </w:r>
           </w:p>
@@ -8708,7 +9955,21 @@
             <w:hideMark/>
           </w:tcPr>
           <w:p>
+            <w:pPr>
+              <w:jc w:val="center"/>
+              <w:rPr>
+                <w:rFonts w:ascii="Arial" w:hAnsi="Arial" w:cs="Arial"/>
+                <w:color w:val="000000"/>
+                <w:sz w:val="21"/>
+                <w:szCs w:val="21"/>
+              </w:rPr>
+            </w:pPr>
             <w:r>
+              <w:rPr>
+                <w:rFonts w:ascii="Arial" w:hAnsi="Arial"/>
+                <w:color w:val="000000"/>
+                <w:sz w:val="21"/>
+              </w:rPr>
               <w:t>{{ d.pct }}</w:t>
             </w:r>
           </w:p>
@@ -8861,7 +10122,24 @@
             <w:hideMark/>
           </w:tcPr>
           <w:p>
+            <w:pPr>
+              <w:jc w:val="center"/>
+              <w:rPr>
+                <w:rFonts w:ascii="Arial" w:hAnsi="Arial" w:cs="Arial"/>
+                <w:b/>
+                <w:bCs/>
+                <w:color w:val="000000"/>
+                <w:sz w:val="21"/>
+                <w:szCs w:val="21"/>
+              </w:rPr>
+            </w:pPr>
             <w:r>
+              <w:rPr>
+                <w:rFonts w:ascii="Arial" w:hAnsi="Arial"/>
+                <w:b/>
+                <w:color w:val="000000"/>
+                <w:sz w:val="21"/>
+              </w:rPr>
               <w:t>Grand Total</w:t>
             </w:r>
           </w:p>
@@ -8880,7 +10158,24 @@
             <w:hideMark/>
           </w:tcPr>
           <w:p>
+            <w:pPr>
+              <w:jc w:val="center"/>
+              <w:rPr>
+                <w:rFonts w:ascii="Arial" w:hAnsi="Arial" w:cs="Arial"/>
+                <w:b/>
+                <w:bCs/>
+                <w:color w:val="000000"/>
+                <w:sz w:val="21"/>
+                <w:szCs w:val="21"/>
+              </w:rPr>
+            </w:pPr>
             <w:r>
+              <w:rPr>
+                <w:rFonts w:ascii="Arial" w:hAnsi="Arial"/>
+                <w:b/>
+                <w:color w:val="000000"/>
+                <w:sz w:val="21"/>
+              </w:rPr>
               <w:t>{{ p4_dtot.volume }}</w:t>
             </w:r>
           </w:p>
@@ -8899,7 +10194,24 @@
             <w:hideMark/>
           </w:tcPr>
           <w:p>
+            <w:pPr>
+              <w:jc w:val="center"/>
+              <w:rPr>
+                <w:rFonts w:ascii="Arial" w:hAnsi="Arial" w:cs="Arial"/>
+                <w:b/>
+                <w:bCs/>
+                <w:color w:val="000000"/>
+                <w:sz w:val="21"/>
+                <w:szCs w:val="21"/>
+              </w:rPr>
+            </w:pPr>
             <w:r>
+              <w:rPr>
+                <w:rFonts w:ascii="Arial" w:hAnsi="Arial"/>
+                <w:b/>
+                <w:color w:val="000000"/>
+                <w:sz w:val="21"/>
+              </w:rPr>
               <w:t>{{ p4_dtot.docket }}</w:t>
             </w:r>
           </w:p>
@@ -8916,7 +10228,24 @@
             <w:shd w:val="clear" w:color="D9E1F2" w:fill="D9E1F2"/>
           </w:tcPr>
           <w:p>
+            <w:pPr>
+              <w:jc w:val="center"/>
+              <w:rPr>
+                <w:rFonts w:ascii="Arial" w:hAnsi="Arial" w:cs="Arial"/>
+                <w:b/>
+                <w:bCs/>
+                <w:color w:val="000000"/>
+                <w:sz w:val="21"/>
+                <w:szCs w:val="21"/>
+              </w:rPr>
+            </w:pPr>
             <w:r>
+              <w:rPr>
+                <w:rFonts w:ascii="Arial" w:hAnsi="Arial"/>
+                <w:b/>
+                <w:color w:val="000000"/>
+                <w:sz w:val="21"/>
+              </w:rPr>
               <w:t>{{ p4_dtot.variance }}</w:t>
             </w:r>
           </w:p>
@@ -8935,7 +10264,24 @@
             <w:hideMark/>
           </w:tcPr>
           <w:p>
+            <w:pPr>
+              <w:jc w:val="center"/>
+              <w:rPr>
+                <w:rFonts w:ascii="Arial" w:hAnsi="Arial" w:cs="Arial"/>
+                <w:b/>
+                <w:bCs/>
+                <w:color w:val="000000"/>
+                <w:sz w:val="21"/>
+                <w:szCs w:val="21"/>
+              </w:rPr>
+            </w:pPr>
             <w:r>
+              <w:rPr>
+                <w:rFonts w:ascii="Arial" w:hAnsi="Arial"/>
+                <w:b/>
+                <w:color w:val="000000"/>
+                <w:sz w:val="21"/>
+              </w:rPr>
               <w:t>{{ p4_dtot.pct }}</w:t>
             </w:r>
           </w:p>
@@ -9326,6 +10672,7 @@
       <w:r>
         <w:rPr>
           <w:rFonts w:ascii="Arial" w:hAnsi="Arial"/>
+          <w:color w:val="000000"/>
         </w:rPr>
         <w:t>{{r p1_disp_total }}</w:t>
       </w:r>
@@ -9357,6 +10704,7 @@
         <w:rPr>
           <w:rFonts w:ascii="Arial" w:hAnsi="Arial"/>
           <w:b/>
+          <w:color w:val="000000"/>
         </w:rPr>
         <w:t>{{r p1_disp_equipment_line }}</w:t>
       </w:r>
@@ -9378,6 +10726,7 @@
         <w:rPr>
           <w:rFonts w:ascii="Arial" w:hAnsi="Arial"/>
           <w:b/>
+          <w:color w:val="000000"/>
         </w:rPr>
         <w:t>{{r p1_disp_other_line }}</w:t>
       </w:r>
@@ -9401,6 +10750,7 @@
         <w:rPr>
           <w:rFonts w:ascii="Arial" w:hAnsi="Arial"/>
           <w:b/>
+          <w:color w:val="000000"/>
         </w:rPr>
         <w:t>{{r p1_disp_transfers_line }}</w:t>
       </w:r>
@@ -9609,6 +10959,7 @@
       <w:r>
         <w:rPr>
           <w:rFonts w:ascii="Arial" w:hAnsi="Arial"/>
+          <w:color w:val="000000"/>
         </w:rPr>
         <w:t>{{r p2_disp_total }}</w:t>
       </w:r>
@@ -9640,6 +10991,7 @@
         <w:rPr>
           <w:rFonts w:ascii="Arial" w:hAnsi="Arial"/>
           <w:b/>
+          <w:color w:val="000000"/>
         </w:rPr>
         <w:t>{{r p2_disp_equipment_line }}</w:t>
       </w:r>
@@ -9661,6 +11013,7 @@
         <w:rPr>
           <w:rFonts w:ascii="Arial" w:hAnsi="Arial"/>
           <w:b/>
+          <w:color w:val="000000"/>
         </w:rPr>
         <w:t>{{r p2_disp_other_line }}</w:t>
       </w:r>
@@ -9684,6 +11037,7 @@
         <w:rPr>
           <w:rFonts w:ascii="Arial" w:hAnsi="Arial"/>
           <w:b/>
+          <w:color w:val="000000"/>
         </w:rPr>
         <w:t>{{r p2_disp_transfers_line }}</w:t>
       </w:r>
@@ -10017,6 +11371,7 @@
       <w:r>
         <w:rPr>
           <w:rFonts w:ascii="Arial" w:hAnsi="Arial"/>
+          <w:color w:val="000000"/>
         </w:rPr>
         <w:t>{{r p3_disp_total }}</w:t>
       </w:r>
@@ -10048,6 +11403,7 @@
         <w:rPr>
           <w:rFonts w:ascii="Arial" w:hAnsi="Arial"/>
           <w:b/>
+          <w:color w:val="000000"/>
         </w:rPr>
         <w:t>{{r p3_disp_equipment_line }}</w:t>
       </w:r>
@@ -10069,6 +11425,7 @@
         <w:rPr>
           <w:rFonts w:ascii="Arial" w:hAnsi="Arial"/>
           <w:b/>
+          <w:color w:val="000000"/>
         </w:rPr>
         <w:t>{{r p3_disp_other_line }}</w:t>
       </w:r>
@@ -10092,6 +11449,7 @@
         <w:rPr>
           <w:rFonts w:ascii="Arial" w:hAnsi="Arial"/>
           <w:b/>
+          <w:color w:val="000000"/>
         </w:rPr>
         <w:t>{{r p3_disp_transfers_line }}</w:t>
       </w:r>
@@ -10412,6 +11770,7 @@
       <w:r>
         <w:rPr>
           <w:rFonts w:ascii="Arial" w:hAnsi="Arial"/>
+          <w:color w:val="000000"/>
         </w:rPr>
         <w:t>{{r p4_disp_total }}</w:t>
       </w:r>
@@ -10443,6 +11802,7 @@
         <w:rPr>
           <w:rFonts w:ascii="Arial" w:hAnsi="Arial"/>
           <w:b/>
+          <w:color w:val="000000"/>
         </w:rPr>
         <w:t>{{r p4_disp_equipment_line }}</w:t>
       </w:r>
@@ -10464,6 +11824,7 @@
         <w:rPr>
           <w:rFonts w:ascii="Arial" w:hAnsi="Arial"/>
           <w:b/>
+          <w:color w:val="000000"/>
         </w:rPr>
         <w:t>{{r p4_disp_other_line }}</w:t>
       </w:r>
@@ -10487,6 +11848,7 @@
         <w:rPr>
           <w:rFonts w:ascii="Arial" w:hAnsi="Arial"/>
           <w:b/>
+          <w:color w:val="000000"/>
         </w:rPr>
         <w:t>{{r p4_disp_transfers_line }}</w:t>
       </w:r>
@@ -10905,6 +12267,7 @@
       <w:r>
         <w:rPr>
           <w:rFonts w:ascii="Arial" w:hAnsi="Arial"/>
+          <w:color w:val="000000"/>
         </w:rPr>
         <w:t>{{ fig10 }}</w:t>
       </w:r>
@@ -11105,6 +12468,7 @@
       <w:r>
         <w:rPr>
           <w:rFonts w:ascii="Arial" w:hAnsi="Arial"/>
+          <w:color w:val="000000"/>
         </w:rPr>
         <w:t>{{ fig12 }}</w:t>
       </w:r>
@@ -11367,6 +12731,7 @@
       <w:r>
         <w:rPr>
           <w:rFonts w:ascii="Arial" w:hAnsi="Arial"/>
+          <w:color w:val="000000"/>
         </w:rPr>
         <w:t>{{ fig14 }}</w:t>
       </w:r>
@@ -11673,6 +13038,7 @@
       <w:r>
         <w:rPr>
           <w:rFonts w:ascii="Arial" w:hAnsi="Arial"/>
+          <w:color w:val="000000"/>
         </w:rPr>
         <w:t>{{ fig16 }}</w:t>
       </w:r>
@@ -11941,6 +13307,7 @@
       <w:r>
         <w:rPr>
           <w:rFonts w:ascii="Arial" w:hAnsi="Arial"/>
+          <w:color w:val="000000"/>
         </w:rPr>
         <w:t>{{ fig18 }}</w:t>
       </w:r>
@@ -12587,6 +13954,7 @@
       <w:r>
         <w:rPr>
           <w:rFonts w:ascii="Arial" w:hAnsi="Arial"/>
+          <w:color w:val="215E99"/>
         </w:rPr>
         <w:t>{{ fig_tasks }}</w:t>
       </w:r>

</xml_diff>